<commit_message>
paper: narrow traceability impact claims
</commit_message>
<xml_diff>
--- a/results/paper/focused_candidate_20261028_01/年报与法规双源RAG_聚焦主问题候选稿_待终审.docx
+++ b/results/paper/focused_candidate_20261028_01/年报与法规双源RAG_聚焦主问题候选稿_待终审.docx
@@ -21713,7 +21713,7 @@
         <w:widowControl/>
       </w:pPr>
       <w:r>
-        <w:t>对一个面向实际文件的系统而言，原文可回放和来源组织清晰有独立的工程价值。它们降低事后复核时查找材料的成本，也使错误能定位到解析、检索、上下文组装或生成环节。然而，这种工程价值不能抵消回答质量上的负结果；如果简化配置更好，应保留该现象，而不是只展示符合预期的比较。</w:t>
+        <w:t>对一个面向实际文件的系统而言，原文可回放和来源组织清晰有独立的工程价值。它们使材料可回放，便于事后复核时定位所用材料，并为区分解析、检索、上下文组装和生成错误提供记录。然而，这种工程价值不能抵消回答质量上的负结果；如果简化配置更好，应保留该现象，而不是只展示符合预期的比较。</w:t>
       </w:r>
     </w:p>
     <w:p>
@@ -21865,7 +21865,7 @@
         <w:widowControl/>
       </w:pPr>
       <w:r>
-        <w:t>部署时可优先采用能够保留身份、版本和定位记录的简单配置，明确区分材料缺失、检索未命中与实际不存在。对于涉及法规适用的事项，界面应展示可获得的事项时间与版本依据以及未知状态。本文的证据支持这种可审计设计的必要性，但尚不能量化其对真实决策风险或人员工作效率的全部影响。</w:t>
+        <w:t>部署时可优先采用能够保留身份、版本和定位记录的简单配置，明确区分材料缺失、检索未命中与实际不存在。对于涉及法规适用的事项，界面应展示可获得的事项时间与版本依据以及未知状态。这些建议来自本研究观察到的来源供给与法规版本限制；本研究未直接检验其能否降低决策风险、复核成本或人员工作时间。</w:t>
       </w:r>
     </w:p>
     <w:p>

</xml_diff>